<commit_message>
fix: soporte robusto de filas multiples y actualizar plantilla DOCX
</commit_message>
<xml_diff>
--- a/CARTA_NOTARIAL.docx
+++ b/CARTA_NOTARIAL.docx
@@ -19,55 +19,7 @@
           <w:sz w:val="20"/>
           <w:szCs w:val="20"/>
         </w:rPr>
-        <w:t>Tarapoto</w:t>
-      </w:r>
-      <w:r>
-        <w:rPr>
-          <w:rFonts w:ascii="Lato" w:eastAsia="Lato" w:hAnsi="Lato" w:cs="Lato"/>
-          <w:sz w:val="20"/>
-          <w:szCs w:val="20"/>
-        </w:rPr>
-        <w:t>, 2</w:t>
-      </w:r>
-      <w:r>
-        <w:rPr>
-          <w:rFonts w:ascii="Lato" w:eastAsia="Lato" w:hAnsi="Lato" w:cs="Lato"/>
-          <w:sz w:val="20"/>
-          <w:szCs w:val="20"/>
-        </w:rPr>
-        <w:t>4</w:t>
-      </w:r>
-      <w:r>
-        <w:rPr>
-          <w:rFonts w:ascii="Lato" w:eastAsia="Lato" w:hAnsi="Lato" w:cs="Lato"/>
-          <w:sz w:val="20"/>
-          <w:szCs w:val="20"/>
-        </w:rPr>
-        <w:t xml:space="preserve"> </w:t>
-      </w:r>
-      <w:r>
-        <w:rPr>
-          <w:rFonts w:ascii="Lato" w:eastAsia="Lato" w:hAnsi="Lato" w:cs="Lato"/>
-          <w:sz w:val="20"/>
-          <w:szCs w:val="20"/>
-        </w:rPr>
-        <w:t>de Diciembre del</w:t>
-      </w:r>
-      <w:r>
-        <w:rPr>
-          <w:rFonts w:ascii="Lato" w:eastAsia="Lato" w:hAnsi="Lato" w:cs="Lato"/>
-          <w:sz w:val="20"/>
-          <w:szCs w:val="20"/>
-        </w:rPr>
-        <w:t xml:space="preserve"> 202</w:t>
-      </w:r>
-      <w:r>
-        <w:rPr>
-          <w:rFonts w:ascii="Lato" w:eastAsia="Lato" w:hAnsi="Lato" w:cs="Lato"/>
-          <w:sz w:val="20"/>
-          <w:szCs w:val="20"/>
-        </w:rPr>
-        <w:t>4</w:t>
+        <w:t>Tarapoto, 24 de Diciembre del 2024</w:t>
       </w:r>
     </w:p>
     <w:p>
@@ -427,6 +379,7 @@
                 <w:right w:val="nil"/>
                 <w:between w:val="nil"/>
               </w:pBdr>
+              <w:jc w:val="center"/>
               <w:rPr>
                 <w:rFonts w:ascii="Lato" w:eastAsia="Lato" w:hAnsi="Lato" w:cs="Lato"/>
                 <w:b/>
@@ -470,7 +423,7 @@
           </w:tcPr>
           <w:p>
             <w:pPr>
-              <w:jc w:val="both"/>
+              <w:jc w:val="center"/>
               <w:rPr>
                 <w:rFonts w:ascii="Lato" w:eastAsia="Lato" w:hAnsi="Lato" w:cs="Lato"/>
                 <w:sz w:val="20"/>
@@ -485,54 +438,7 @@
           </w:tcPr>
           <w:p>
             <w:pPr>
-              <w:jc w:val="both"/>
-              <w:rPr>
-                <w:rFonts w:ascii="Lato" w:eastAsia="Lato" w:hAnsi="Lato" w:cs="Lato"/>
-                <w:sz w:val="20"/>
-                <w:szCs w:val="20"/>
-              </w:rPr>
-            </w:pPr>
-          </w:p>
-        </w:tc>
-      </w:tr>
-      <w:tr>
-        <w:tc>
-          <w:tcPr>
-            <w:tcW w:w="2942" w:type="dxa"/>
-          </w:tcPr>
-          <w:p>
-            <w:pPr>
-              <w:jc w:val="both"/>
-              <w:rPr>
-                <w:rFonts w:ascii="Lato" w:eastAsia="Lato" w:hAnsi="Lato" w:cs="Lato"/>
-                <w:sz w:val="20"/>
-                <w:szCs w:val="20"/>
-              </w:rPr>
-            </w:pPr>
-          </w:p>
-        </w:tc>
-        <w:tc>
-          <w:tcPr>
-            <w:tcW w:w="2943" w:type="dxa"/>
-          </w:tcPr>
-          <w:p>
-            <w:pPr>
-              <w:jc w:val="both"/>
-              <w:rPr>
-                <w:rFonts w:ascii="Lato" w:eastAsia="Lato" w:hAnsi="Lato" w:cs="Lato"/>
-                <w:sz w:val="20"/>
-                <w:szCs w:val="20"/>
-              </w:rPr>
-            </w:pPr>
-          </w:p>
-        </w:tc>
-        <w:tc>
-          <w:tcPr>
-            <w:tcW w:w="2943" w:type="dxa"/>
-          </w:tcPr>
-          <w:p>
-            <w:pPr>
-              <w:jc w:val="both"/>
+              <w:jc w:val="center"/>
               <w:rPr>
                 <w:rFonts w:ascii="Lato" w:eastAsia="Lato" w:hAnsi="Lato" w:cs="Lato"/>
                 <w:sz w:val="20"/>
@@ -797,7 +703,7 @@
           <w:pgSz w:w="12240" w:h="15840"/>
           <w:pgMar w:top="1417" w:right="1701" w:bottom="1417" w:left="1701" w:header="270" w:footer="708" w:gutter="0"/>
           <w:pgNumType w:start="1"/>
-          <w:cols w:num="2" w:space="720"/>
+          <w:cols w:space="720"/>
         </w:sectPr>
       </w:pPr>
     </w:p>
@@ -806,6 +712,13 @@
         <w:rPr>
           <w:rFonts w:ascii="Arial" w:hAnsi="Arial" w:cs="Arial"/>
         </w:rPr>
+        <w:sectPr>
+          <w:type w:val="continuous"/>
+          <w:pgSz w:w="12240" w:h="15840"/>
+          <w:pgMar w:top="1417" w:right="1701" w:bottom="1417" w:left="1701" w:header="270" w:footer="708" w:gutter="0"/>
+          <w:pgNumType w:start="1"/>
+          <w:cols w:space="720"/>
+        </w:sectPr>
       </w:pPr>
     </w:p>
     <w:p>
@@ -824,286 +737,32 @@
     </w:p>
     <w:p>
       <w:pPr>
-        <w:jc w:val="center"/>
         <w:rPr>
           <w:rFonts w:ascii="Arial" w:hAnsi="Arial" w:cs="Arial"/>
         </w:rPr>
       </w:pPr>
-    </w:p>
-    <w:p>
-      <w:pPr>
-        <w:jc w:val="center"/>
-        <w:rPr>
-          <w:rFonts w:ascii="Arial" w:hAnsi="Arial" w:cs="Arial"/>
-        </w:rPr>
-      </w:pPr>
-    </w:p>
-    <w:p>
-      <w:pPr>
-        <w:jc w:val="center"/>
-        <w:rPr>
-          <w:rFonts w:ascii="Arial" w:eastAsia="Lato" w:hAnsi="Arial" w:cs="Arial"/>
-          <w:sz w:val="20"/>
-          <w:szCs w:val="20"/>
-        </w:rPr>
-      </w:pPr>
-      <w:r>
-        <w:rPr>
-          <w:rFonts w:ascii="Arial" w:hAnsi="Arial" w:cs="Arial"/>
-          <w:noProof/>
-        </w:rPr>
-        <mc:AlternateContent>
-          <mc:Choice Requires="wps">
-            <w:drawing>
-              <wp:anchor distT="0" distB="0" distL="114300" distR="114300" simplePos="0" relativeHeight="251659264" behindDoc="0" locked="0" layoutInCell="1" allowOverlap="1">
-                <wp:simplePos x="0" y="0"/>
-                <wp:positionH relativeFrom="column">
-                  <wp:posOffset>344805</wp:posOffset>
-                </wp:positionH>
-                <wp:positionV relativeFrom="paragraph">
-                  <wp:posOffset>86995</wp:posOffset>
-                </wp:positionV>
-                <wp:extent cx="1798320" cy="0"/>
-                <wp:effectExtent l="0" t="12700" r="17780" b="12700"/>
-                <wp:wrapNone/>
-                <wp:docPr id="1144434765" name="Conector recto 3"/>
-                <wp:cNvGraphicFramePr/>
-                <a:graphic xmlns:a="http://schemas.openxmlformats.org/drawingml/2006/main">
-                  <a:graphicData uri="http://schemas.microsoft.com/office/word/2010/wordprocessingShape">
-                    <wps:wsp>
-                      <wps:cNvCnPr/>
-                      <wps:spPr>
-                        <a:xfrm>
-                          <a:off x="0" y="0"/>
-                          <a:ext cx="1798320" cy="0"/>
-                        </a:xfrm>
-                        <a:prstGeom prst="line">
-                          <a:avLst/>
-                        </a:prstGeom>
-                        <a:ln w="19050">
-                          <a:solidFill>
-                            <a:schemeClr val="tx1"/>
-                          </a:solidFill>
-                        </a:ln>
-                      </wps:spPr>
-                      <wps:style>
-                        <a:lnRef idx="1">
-                          <a:schemeClr val="accent6"/>
-                        </a:lnRef>
-                        <a:fillRef idx="0">
-                          <a:schemeClr val="accent6"/>
-                        </a:fillRef>
-                        <a:effectRef idx="0">
-                          <a:schemeClr val="accent6"/>
-                        </a:effectRef>
-                        <a:fontRef idx="minor">
-                          <a:schemeClr val="tx1"/>
-                        </a:fontRef>
-                      </wps:style>
-                      <wps:bodyPr/>
-                    </wps:wsp>
-                  </a:graphicData>
-                </a:graphic>
-                <wp14:sizeRelH relativeFrom="margin">
-                  <wp14:pctWidth>0</wp14:pctWidth>
-                </wp14:sizeRelH>
-              </wp:anchor>
-            </w:drawing>
-          </mc:Choice>
-          <mc:Fallback>
-            <w:pict>
-              <v:line w14:anchorId="71C93EB1" id="Conector recto 3" o:spid="_x0000_s1026" style="position:absolute;z-index:251659264;visibility:visible;mso-wrap-style:square;mso-width-percent:0;mso-wrap-distance-left:9pt;mso-wrap-distance-top:0;mso-wrap-distance-right:9pt;mso-wrap-distance-bottom:0;mso-position-horizontal:absolute;mso-position-horizontal-relative:text;mso-position-vertical:absolute;mso-position-vertical-relative:text;mso-width-percent:0;mso-width-relative:margin" from="27.15pt,6.85pt" to="168.75pt,6.85pt" o:gfxdata="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" strokecolor="black [3213]" strokeweight="1.5pt"/>
-            </w:pict>
-          </mc:Fallback>
-        </mc:AlternateContent>
-      </w:r>
     </w:p>
     <w:p>
       <w:pPr>
         <w:tabs>
           <w:tab w:val="left" w:pos="2603"/>
         </w:tabs>
-        <w:jc w:val="center"/>
         <w:rPr>
           <w:rFonts w:ascii="Arial" w:hAnsi="Arial" w:cs="Arial"/>
-          <w:sz w:val="20"/>
-          <w:szCs w:val="20"/>
-        </w:rPr>
-      </w:pPr>
-      <w:r>
-        <w:rPr>
-          <w:rFonts w:ascii="Arial" w:hAnsi="Arial" w:cs="Arial"/>
-          <w:sz w:val="20"/>
-          <w:szCs w:val="20"/>
-        </w:rPr>
-        <w:t>BBVA PERU</w:t>
-      </w:r>
+        </w:rPr>
+      </w:pPr>
     </w:p>
     <w:p>
       <w:pPr>
         <w:tabs>
           <w:tab w:val="left" w:pos="2603"/>
         </w:tabs>
-        <w:jc w:val="center"/>
         <w:rPr>
           <w:rFonts w:ascii="Arial" w:hAnsi="Arial" w:cs="Arial"/>
-        </w:rPr>
-      </w:pPr>
-    </w:p>
-    <w:p>
-      <w:pPr>
-        <w:tabs>
-          <w:tab w:val="left" w:pos="2603"/>
-        </w:tabs>
-        <w:rPr>
-          <w:rFonts w:ascii="Arial" w:hAnsi="Arial" w:cs="Arial"/>
-        </w:rPr>
-      </w:pPr>
-    </w:p>
-    <w:p>
-      <w:pPr>
-        <w:tabs>
-          <w:tab w:val="left" w:pos="2603"/>
-        </w:tabs>
-        <w:rPr>
-          <w:rFonts w:ascii="Arial" w:hAnsi="Arial" w:cs="Arial"/>
-        </w:rPr>
-      </w:pPr>
-    </w:p>
-    <w:p>
-      <w:pPr>
-        <w:tabs>
-          <w:tab w:val="left" w:pos="2603"/>
-        </w:tabs>
-        <w:jc w:val="center"/>
-        <w:rPr>
-          <w:rFonts w:ascii="Arial" w:hAnsi="Arial" w:cs="Arial"/>
-        </w:rPr>
-      </w:pPr>
-    </w:p>
-    <w:p>
-      <w:pPr>
-        <w:tabs>
-          <w:tab w:val="left" w:pos="2603"/>
-        </w:tabs>
-        <w:jc w:val="center"/>
-        <w:rPr>
-          <w:rFonts w:ascii="Arial" w:hAnsi="Arial" w:cs="Arial"/>
-        </w:rPr>
-      </w:pPr>
-    </w:p>
-    <w:p>
-      <w:pPr>
-        <w:tabs>
-          <w:tab w:val="left" w:pos="2603"/>
-        </w:tabs>
-        <w:jc w:val="center"/>
-        <w:rPr>
-          <w:rFonts w:ascii="Arial" w:hAnsi="Arial" w:cs="Arial"/>
-        </w:rPr>
-      </w:pPr>
-    </w:p>
-    <w:p>
-      <w:pPr>
-        <w:tabs>
-          <w:tab w:val="left" w:pos="2603"/>
-        </w:tabs>
-        <w:jc w:val="center"/>
-        <w:rPr>
-          <w:rFonts w:ascii="Arial" w:hAnsi="Arial" w:cs="Arial"/>
-        </w:rPr>
-      </w:pPr>
-      <w:r>
-        <w:rPr>
-          <w:rFonts w:ascii="Arial" w:hAnsi="Arial" w:cs="Arial"/>
-          <w:noProof/>
-        </w:rPr>
-        <mc:AlternateContent>
-          <mc:Choice Requires="wps">
-            <w:drawing>
-              <wp:anchor distT="0" distB="0" distL="114300" distR="114300" simplePos="0" relativeHeight="251661312" behindDoc="0" locked="0" layoutInCell="1" allowOverlap="1" wp14:anchorId="5DDB439B" wp14:editId="3FBD7F61">
-                <wp:simplePos x="0" y="0"/>
-                <wp:positionH relativeFrom="column">
-                  <wp:posOffset>373380</wp:posOffset>
-                </wp:positionH>
-                <wp:positionV relativeFrom="paragraph">
-                  <wp:posOffset>86995</wp:posOffset>
-                </wp:positionV>
-                <wp:extent cx="1798320" cy="0"/>
-                <wp:effectExtent l="0" t="12700" r="17780" b="12700"/>
-                <wp:wrapNone/>
-                <wp:docPr id="99804839" name="Conector recto 3"/>
-                <wp:cNvGraphicFramePr/>
-                <a:graphic xmlns:a="http://schemas.openxmlformats.org/drawingml/2006/main">
-                  <a:graphicData uri="http://schemas.microsoft.com/office/word/2010/wordprocessingShape">
-                    <wps:wsp>
-                      <wps:cNvCnPr/>
-                      <wps:spPr>
-                        <a:xfrm>
-                          <a:off x="0" y="0"/>
-                          <a:ext cx="1798320" cy="0"/>
-                        </a:xfrm>
-                        <a:prstGeom prst="line">
-                          <a:avLst/>
-                        </a:prstGeom>
-                        <a:ln w="19050">
-                          <a:solidFill>
-                            <a:schemeClr val="tx1"/>
-                          </a:solidFill>
-                        </a:ln>
-                      </wps:spPr>
-                      <wps:style>
-                        <a:lnRef idx="1">
-                          <a:schemeClr val="accent6"/>
-                        </a:lnRef>
-                        <a:fillRef idx="0">
-                          <a:schemeClr val="accent6"/>
-                        </a:fillRef>
-                        <a:effectRef idx="0">
-                          <a:schemeClr val="accent6"/>
-                        </a:effectRef>
-                        <a:fontRef idx="minor">
-                          <a:schemeClr val="tx1"/>
-                        </a:fontRef>
-                      </wps:style>
-                      <wps:bodyPr/>
-                    </wps:wsp>
-                  </a:graphicData>
-                </a:graphic>
-                <wp14:sizeRelH relativeFrom="margin">
-                  <wp14:pctWidth>0</wp14:pctWidth>
-                </wp14:sizeRelH>
-              </wp:anchor>
-            </w:drawing>
-          </mc:Choice>
-          <mc:Fallback>
-            <w:pict>
-              <v:line w14:anchorId="1814D071" id="Conector recto 3" o:spid="_x0000_s1026" style="position:absolute;z-index:251661312;visibility:visible;mso-wrap-style:square;mso-width-percent:0;mso-wrap-distance-left:9pt;mso-wrap-distance-top:0;mso-wrap-distance-right:9pt;mso-wrap-distance-bottom:0;mso-position-horizontal:absolute;mso-position-horizontal-relative:text;mso-position-vertical:absolute;mso-position-vertical-relative:text;mso-width-percent:0;mso-width-relative:margin" from="29.4pt,6.85pt" to="171pt,6.85pt" o:gfxdata="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" strokecolor="black [3213]" strokeweight="1.5pt"/>
-            </w:pict>
-          </mc:Fallback>
-        </mc:AlternateContent>
-      </w:r>
-    </w:p>
-    <w:p>
-      <w:pPr>
-        <w:tabs>
-          <w:tab w:val="left" w:pos="2603"/>
-        </w:tabs>
-        <w:jc w:val="center"/>
-        <w:rPr>
-          <w:rFonts w:ascii="Arial" w:hAnsi="Arial" w:cs="Arial"/>
-          <w:sz w:val="20"/>
-          <w:szCs w:val="20"/>
-        </w:rPr>
-      </w:pPr>
-      <w:r>
-        <w:rPr>
-          <w:rFonts w:ascii="Arial" w:hAnsi="Arial" w:cs="Arial"/>
-          <w:sz w:val="20"/>
-          <w:szCs w:val="20"/>
-        </w:rPr>
-        <w:t>BBVA PERU</w:t>
-      </w:r>
+          <w:sz w:val="20"/>
+          <w:szCs w:val="20"/>
+        </w:rPr>
+      </w:pPr>
     </w:p>
     <w:p>
       <w:pPr>
@@ -1123,7 +782,7 @@
       <w:pgSz w:w="12240" w:h="15840"/>
       <w:pgMar w:top="1417" w:right="1701" w:bottom="1417" w:left="1701" w:header="270" w:footer="708" w:gutter="0"/>
       <w:pgNumType w:start="1"/>
-      <w:cols w:num="2" w:space="720"/>
+      <w:cols w:space="720"/>
     </w:sectPr>
   </w:body>
 </w:document>
@@ -1184,7 +843,7 @@
         <wp:inline distT="114300" distB="114300" distL="114300" distR="114300">
           <wp:extent cx="1838325" cy="552450"/>
           <wp:effectExtent l="0" t="0" r="0" b="0"/>
-          <wp:docPr id="1" name="image1.png"/>
+          <wp:docPr id="203337187" name="image1.png"/>
           <wp:cNvGraphicFramePr/>
           <a:graphic xmlns:a="http://schemas.openxmlformats.org/drawingml/2006/main">
             <a:graphicData uri="http://schemas.openxmlformats.org/drawingml/2006/picture">

</xml_diff>